<commit_message>
adding new progress to repo
</commit_message>
<xml_diff>
--- a/Project1/Final Report/FinalReport_Draft3.docx
+++ b/Project1/Final Report/FinalReport_Draft3.docx
@@ -523,12 +523,6 @@
         <w:gridCol w:w="1113"/>
       </w:tblGrid>
       <w:tr>
-        <w:tblPrEx>
-          <w:tblCellMar>
-            <w:top w:w="0" w:type="dxa"/>
-            <w:bottom w:w="0" w:type="dxa"/>
-          </w:tblCellMar>
-        </w:tblPrEx>
         <w:tc>
           <w:tcPr>
             <w:tcW w:w="1600" w:type="dxa"/>
@@ -782,12 +776,6 @@
         </w:tc>
       </w:tr>
       <w:tr>
-        <w:tblPrEx>
-          <w:tblCellMar>
-            <w:top w:w="0" w:type="dxa"/>
-            <w:bottom w:w="0" w:type="dxa"/>
-          </w:tblCellMar>
-        </w:tblPrEx>
         <w:tc>
           <w:tcPr>
             <w:tcW w:w="1600" w:type="dxa"/>
@@ -1022,12 +1010,6 @@
         </w:tc>
       </w:tr>
       <w:tr>
-        <w:tblPrEx>
-          <w:tblCellMar>
-            <w:top w:w="0" w:type="dxa"/>
-            <w:bottom w:w="0" w:type="dxa"/>
-          </w:tblCellMar>
-        </w:tblPrEx>
         <w:tc>
           <w:tcPr>
             <w:tcW w:w="1600" w:type="dxa"/>
@@ -1262,12 +1244,6 @@
         </w:tc>
       </w:tr>
       <w:tr>
-        <w:tblPrEx>
-          <w:tblCellMar>
-            <w:top w:w="0" w:type="dxa"/>
-            <w:bottom w:w="0" w:type="dxa"/>
-          </w:tblCellMar>
-        </w:tblPrEx>
         <w:tc>
           <w:tcPr>
             <w:tcW w:w="1600" w:type="dxa"/>
@@ -1500,12 +1476,6 @@
         </w:tc>
       </w:tr>
       <w:tr>
-        <w:tblPrEx>
-          <w:tblCellMar>
-            <w:top w:w="0" w:type="dxa"/>
-            <w:bottom w:w="0" w:type="dxa"/>
-          </w:tblCellMar>
-        </w:tblPrEx>
         <w:tc>
           <w:tcPr>
             <w:tcW w:w="1600" w:type="dxa"/>
@@ -1738,12 +1708,6 @@
         </w:tc>
       </w:tr>
       <w:tr>
-        <w:tblPrEx>
-          <w:tblCellMar>
-            <w:top w:w="0" w:type="dxa"/>
-            <w:bottom w:w="0" w:type="dxa"/>
-          </w:tblCellMar>
-        </w:tblPrEx>
         <w:tc>
           <w:tcPr>
             <w:tcW w:w="1600" w:type="dxa"/>
@@ -1978,12 +1942,6 @@
         </w:tc>
       </w:tr>
       <w:tr>
-        <w:tblPrEx>
-          <w:tblCellMar>
-            <w:top w:w="0" w:type="dxa"/>
-            <w:bottom w:w="0" w:type="dxa"/>
-          </w:tblCellMar>
-        </w:tblPrEx>
         <w:tc>
           <w:tcPr>
             <w:tcW w:w="1600" w:type="dxa"/>
@@ -2218,12 +2176,6 @@
         </w:tc>
       </w:tr>
       <w:tr>
-        <w:tblPrEx>
-          <w:tblCellMar>
-            <w:top w:w="0" w:type="dxa"/>
-            <w:bottom w:w="0" w:type="dxa"/>
-          </w:tblCellMar>
-        </w:tblPrEx>
         <w:tc>
           <w:tcPr>
             <w:tcW w:w="1600" w:type="dxa"/>
@@ -2458,12 +2410,6 @@
         </w:tc>
       </w:tr>
       <w:tr>
-        <w:tblPrEx>
-          <w:tblCellMar>
-            <w:top w:w="0" w:type="dxa"/>
-            <w:bottom w:w="0" w:type="dxa"/>
-          </w:tblCellMar>
-        </w:tblPrEx>
         <w:tc>
           <w:tcPr>
             <w:tcW w:w="1600" w:type="dxa"/>
@@ -2698,12 +2644,6 @@
         </w:tc>
       </w:tr>
       <w:tr>
-        <w:tblPrEx>
-          <w:tblCellMar>
-            <w:top w:w="0" w:type="dxa"/>
-            <w:bottom w:w="0" w:type="dxa"/>
-          </w:tblCellMar>
-        </w:tblPrEx>
         <w:tc>
           <w:tcPr>
             <w:tcW w:w="1600" w:type="dxa"/>
@@ -3709,12 +3649,6 @@
         <w:gridCol w:w="1800"/>
       </w:tblGrid>
       <w:tr>
-        <w:tblPrEx>
-          <w:tblCellMar>
-            <w:top w:w="0" w:type="dxa"/>
-            <w:bottom w:w="0" w:type="dxa"/>
-          </w:tblCellMar>
-        </w:tblPrEx>
         <w:tc>
           <w:tcPr>
             <w:tcW w:w="2200" w:type="dxa"/>
@@ -3860,12 +3794,6 @@
         </w:tc>
       </w:tr>
       <w:tr>
-        <w:tblPrEx>
-          <w:tblCellMar>
-            <w:top w:w="0" w:type="dxa"/>
-            <w:bottom w:w="0" w:type="dxa"/>
-          </w:tblCellMar>
-        </w:tblPrEx>
         <w:tc>
           <w:tcPr>
             <w:tcW w:w="2200" w:type="dxa"/>
@@ -3999,12 +3927,6 @@
         </w:tc>
       </w:tr>
       <w:tr>
-        <w:tblPrEx>
-          <w:tblCellMar>
-            <w:top w:w="0" w:type="dxa"/>
-            <w:bottom w:w="0" w:type="dxa"/>
-          </w:tblCellMar>
-        </w:tblPrEx>
         <w:tc>
           <w:tcPr>
             <w:tcW w:w="2200" w:type="dxa"/>
@@ -4138,12 +4060,6 @@
         </w:tc>
       </w:tr>
       <w:tr>
-        <w:tblPrEx>
-          <w:tblCellMar>
-            <w:top w:w="0" w:type="dxa"/>
-            <w:bottom w:w="0" w:type="dxa"/>
-          </w:tblCellMar>
-        </w:tblPrEx>
         <w:tc>
           <w:tcPr>
             <w:tcW w:w="2200" w:type="dxa"/>
@@ -4279,12 +4195,6 @@
         </w:tc>
       </w:tr>
       <w:tr>
-        <w:tblPrEx>
-          <w:tblCellMar>
-            <w:top w:w="0" w:type="dxa"/>
-            <w:bottom w:w="0" w:type="dxa"/>
-          </w:tblCellMar>
-        </w:tblPrEx>
         <w:tc>
           <w:tcPr>
             <w:tcW w:w="2200" w:type="dxa"/>
@@ -4418,12 +4328,6 @@
         </w:tc>
       </w:tr>
       <w:tr>
-        <w:tblPrEx>
-          <w:tblCellMar>
-            <w:top w:w="0" w:type="dxa"/>
-            <w:bottom w:w="0" w:type="dxa"/>
-          </w:tblCellMar>
-        </w:tblPrEx>
         <w:tc>
           <w:tcPr>
             <w:tcW w:w="2200" w:type="dxa"/>
@@ -4559,12 +4463,6 @@
         </w:tc>
       </w:tr>
       <w:tr>
-        <w:tblPrEx>
-          <w:tblCellMar>
-            <w:top w:w="0" w:type="dxa"/>
-            <w:bottom w:w="0" w:type="dxa"/>
-          </w:tblCellMar>
-        </w:tblPrEx>
         <w:tc>
           <w:tcPr>
             <w:tcW w:w="2200" w:type="dxa"/>
@@ -4700,12 +4598,6 @@
         </w:tc>
       </w:tr>
       <w:tr>
-        <w:tblPrEx>
-          <w:tblCellMar>
-            <w:top w:w="0" w:type="dxa"/>
-            <w:bottom w:w="0" w:type="dxa"/>
-          </w:tblCellMar>
-        </w:tblPrEx>
         <w:tc>
           <w:tcPr>
             <w:tcW w:w="2200" w:type="dxa"/>
@@ -4984,12 +4876,6 @@
         <w:gridCol w:w="2000"/>
       </w:tblGrid>
       <w:tr>
-        <w:tblPrEx>
-          <w:tblCellMar>
-            <w:top w:w="0" w:type="dxa"/>
-            <w:bottom w:w="0" w:type="dxa"/>
-          </w:tblCellMar>
-        </w:tblPrEx>
         <w:tc>
           <w:tcPr>
             <w:tcW w:w="2000" w:type="dxa"/>
@@ -5126,12 +5012,6 @@
         </w:tc>
       </w:tr>
       <w:tr>
-        <w:tblPrEx>
-          <w:tblCellMar>
-            <w:top w:w="0" w:type="dxa"/>
-            <w:bottom w:w="0" w:type="dxa"/>
-          </w:tblCellMar>
-        </w:tblPrEx>
         <w:tc>
           <w:tcPr>
             <w:tcW w:w="2000" w:type="dxa"/>
@@ -5267,12 +5147,6 @@
         </w:tc>
       </w:tr>
       <w:tr>
-        <w:tblPrEx>
-          <w:tblCellMar>
-            <w:top w:w="0" w:type="dxa"/>
-            <w:bottom w:w="0" w:type="dxa"/>
-          </w:tblCellMar>
-        </w:tblPrEx>
         <w:tc>
           <w:tcPr>
             <w:tcW w:w="2000" w:type="dxa"/>
@@ -5405,12 +5279,6 @@
         </w:tc>
       </w:tr>
       <w:tr>
-        <w:tblPrEx>
-          <w:tblCellMar>
-            <w:top w:w="0" w:type="dxa"/>
-            <w:bottom w:w="0" w:type="dxa"/>
-          </w:tblCellMar>
-        </w:tblPrEx>
         <w:tc>
           <w:tcPr>
             <w:tcW w:w="2000" w:type="dxa"/>
@@ -5546,12 +5414,6 @@
         </w:tc>
       </w:tr>
       <w:tr>
-        <w:tblPrEx>
-          <w:tblCellMar>
-            <w:top w:w="0" w:type="dxa"/>
-            <w:bottom w:w="0" w:type="dxa"/>
-          </w:tblCellMar>
-        </w:tblPrEx>
         <w:tc>
           <w:tcPr>
             <w:tcW w:w="2000" w:type="dxa"/>
@@ -5684,12 +5546,6 @@
         </w:tc>
       </w:tr>
       <w:tr>
-        <w:tblPrEx>
-          <w:tblCellMar>
-            <w:top w:w="0" w:type="dxa"/>
-            <w:bottom w:w="0" w:type="dxa"/>
-          </w:tblCellMar>
-        </w:tblPrEx>
         <w:tc>
           <w:tcPr>
             <w:tcW w:w="2000" w:type="dxa"/>
@@ -5823,12 +5679,6 @@
         </w:tc>
       </w:tr>
       <w:tr>
-        <w:tblPrEx>
-          <w:tblCellMar>
-            <w:top w:w="0" w:type="dxa"/>
-            <w:bottom w:w="0" w:type="dxa"/>
-          </w:tblCellMar>
-        </w:tblPrEx>
         <w:tc>
           <w:tcPr>
             <w:tcW w:w="2000" w:type="dxa"/>
@@ -5961,12 +5811,6 @@
         </w:tc>
       </w:tr>
       <w:tr>
-        <w:tblPrEx>
-          <w:tblCellMar>
-            <w:top w:w="0" w:type="dxa"/>
-            <w:bottom w:w="0" w:type="dxa"/>
-          </w:tblCellMar>
-        </w:tblPrEx>
         <w:tc>
           <w:tcPr>
             <w:tcW w:w="2000" w:type="dxa"/>
@@ -6109,12 +5953,6 @@
         </w:tc>
       </w:tr>
       <w:tr>
-        <w:tblPrEx>
-          <w:tblCellMar>
-            <w:top w:w="0" w:type="dxa"/>
-            <w:bottom w:w="0" w:type="dxa"/>
-          </w:tblCellMar>
-        </w:tblPrEx>
         <w:tc>
           <w:tcPr>
             <w:tcW w:w="2000" w:type="dxa"/>
@@ -6229,12 +6067,6 @@
         </w:tc>
       </w:tr>
       <w:tr>
-        <w:tblPrEx>
-          <w:tblCellMar>
-            <w:top w:w="0" w:type="dxa"/>
-            <w:bottom w:w="0" w:type="dxa"/>
-          </w:tblCellMar>
-        </w:tblPrEx>
         <w:tc>
           <w:tcPr>
             <w:tcW w:w="2000" w:type="dxa"/>
@@ -6368,12 +6200,6 @@
         </w:tc>
       </w:tr>
       <w:tr>
-        <w:tblPrEx>
-          <w:tblCellMar>
-            <w:top w:w="0" w:type="dxa"/>
-            <w:bottom w:w="0" w:type="dxa"/>
-          </w:tblCellMar>
-        </w:tblPrEx>
         <w:tc>
           <w:tcPr>
             <w:tcW w:w="2000" w:type="dxa"/>
@@ -6506,12 +6332,6 @@
         </w:tc>
       </w:tr>
       <w:tr>
-        <w:tblPrEx>
-          <w:tblCellMar>
-            <w:top w:w="0" w:type="dxa"/>
-            <w:bottom w:w="0" w:type="dxa"/>
-          </w:tblCellMar>
-        </w:tblPrEx>
         <w:tc>
           <w:tcPr>
             <w:tcW w:w="2000" w:type="dxa"/>
@@ -6647,12 +6467,6 @@
         </w:tc>
       </w:tr>
       <w:tr>
-        <w:tblPrEx>
-          <w:tblCellMar>
-            <w:top w:w="0" w:type="dxa"/>
-            <w:bottom w:w="0" w:type="dxa"/>
-          </w:tblCellMar>
-        </w:tblPrEx>
         <w:tc>
           <w:tcPr>
             <w:tcW w:w="2000" w:type="dxa"/>
@@ -6785,12 +6599,6 @@
         </w:tc>
       </w:tr>
       <w:tr>
-        <w:tblPrEx>
-          <w:tblCellMar>
-            <w:top w:w="0" w:type="dxa"/>
-            <w:bottom w:w="0" w:type="dxa"/>
-          </w:tblCellMar>
-        </w:tblPrEx>
         <w:tc>
           <w:tcPr>
             <w:tcW w:w="2000" w:type="dxa"/>
@@ -6924,12 +6732,6 @@
         </w:tc>
       </w:tr>
       <w:tr>
-        <w:tblPrEx>
-          <w:tblCellMar>
-            <w:top w:w="0" w:type="dxa"/>
-            <w:bottom w:w="0" w:type="dxa"/>
-          </w:tblCellMar>
-        </w:tblPrEx>
         <w:tc>
           <w:tcPr>
             <w:tcW w:w="2000" w:type="dxa"/>
@@ -7053,12 +6855,6 @@
         </w:tc>
       </w:tr>
       <w:tr>
-        <w:tblPrEx>
-          <w:tblCellMar>
-            <w:top w:w="0" w:type="dxa"/>
-            <w:bottom w:w="0" w:type="dxa"/>
-          </w:tblCellMar>
-        </w:tblPrEx>
         <w:tc>
           <w:tcPr>
             <w:tcW w:w="2000" w:type="dxa"/>
@@ -7192,12 +6988,6 @@
         </w:tc>
       </w:tr>
       <w:tr>
-        <w:tblPrEx>
-          <w:tblCellMar>
-            <w:top w:w="0" w:type="dxa"/>
-            <w:bottom w:w="0" w:type="dxa"/>
-          </w:tblCellMar>
-        </w:tblPrEx>
         <w:tc>
           <w:tcPr>
             <w:tcW w:w="2000" w:type="dxa"/>
@@ -7330,12 +7120,6 @@
         </w:tc>
       </w:tr>
       <w:tr>
-        <w:tblPrEx>
-          <w:tblCellMar>
-            <w:top w:w="0" w:type="dxa"/>
-            <w:bottom w:w="0" w:type="dxa"/>
-          </w:tblCellMar>
-        </w:tblPrEx>
         <w:tc>
           <w:tcPr>
             <w:tcW w:w="2000" w:type="dxa"/>
@@ -7469,12 +7253,6 @@
         </w:tc>
       </w:tr>
       <w:tr>
-        <w:tblPrEx>
-          <w:tblCellMar>
-            <w:top w:w="0" w:type="dxa"/>
-            <w:bottom w:w="0" w:type="dxa"/>
-          </w:tblCellMar>
-        </w:tblPrEx>
         <w:tc>
           <w:tcPr>
             <w:tcW w:w="2000" w:type="dxa"/>
@@ -7608,12 +7386,6 @@
         </w:tc>
       </w:tr>
       <w:tr>
-        <w:tblPrEx>
-          <w:tblCellMar>
-            <w:top w:w="0" w:type="dxa"/>
-            <w:bottom w:w="0" w:type="dxa"/>
-          </w:tblCellMar>
-        </w:tblPrEx>
         <w:tc>
           <w:tcPr>
             <w:tcW w:w="2000" w:type="dxa"/>

</xml_diff>